<commit_message>
Remove calendar dates from project documents
</commit_message>
<xml_diff>
--- a/docs/data-audit/F1 Strategy Visualisation Data Audit.docx
+++ b/docs/data-audit/F1 Strategy Visualisation Data Audit.docx
@@ -15,7 +15,7 @@
         <w:pStyle w:val="Subtitle"/>
       </w:pPr>
       <w:r>
-        <w:t>Group Data Visualisation Project    Data Audit    8 October 2026</w:t>
+        <w:t>Group Data Visualisation Project    Data Audit</w:t>
       </w:r>
     </w:p>
     <w:p>
@@ -25,7 +25,7 @@
         <w:contextualSpacing w:val="0"/>
       </w:pPr>
       <w:r>
-        <w:t>We audited FastF1 data for the 2026 Austrian Grand Prix at the Red Bull Ring on 28 June. The comparison contains 426 driver laps with complete core timing and tyre fields. We retain every selected record and mark 361 laps as eligible for initial normal-racing pace analysis. This audit records preparation decisions, not final performance findings.</w:t>
+        <w:t>We audited FastF1 data for the 2026 Austrian Grand Prix at the Red Bull Ring. The comparison contains 426 driver laps with complete core timing and tyre fields. We retain every selected record and mark 361 laps as eligible for initial normal-racing pace analysis. This audit records preparation decisions, not final performance findings.</w:t>
       </w:r>
     </w:p>
     <w:p>
@@ -43,7 +43,7 @@
         <w:contextualSpacing w:val="0"/>
       </w:pPr>
       <w:r>
-        <w:t>Data were accessed on 8 October 2026 using FastF1 3.8.3 and pandas 2.3.3. The raw download contains 1,339 field laps, results, weather, track status and race-control messages. Telemetry was not downloaded. Raw files remain locally; prepared files and the script are shared in the repository. A SHA-256 hash identifies the raw lap snapshot.</w:t>
+        <w:t>Data were accessed using FastF1 3.8.3 and pandas 2.3.3. The raw download contains 1,339 field laps, results, weather, track status and race-control messages. Telemetry was not downloaded. Raw files remain locally; prepared files and the script are shared in the repository. A SHA-256 hash identifies the raw lap snapshot.</w:t>
       </w:r>
     </w:p>
     <w:p>

</xml_diff>

<commit_message>
Validate Austria 2026 lap-boundary timing and reference exclusions
</commit_message>
<xml_diff>
--- a/docs/data-audit/F1 Strategy Visualisation Data Audit.docx
+++ b/docs/data-audit/F1 Strategy Visualisation Data Audit.docx
@@ -3115,7 +3115,7 @@
         <w:contextualSpacing w:val="0"/>
       </w:pPr>
       <w:r>
-        <w:t>The derived gap compares completion times for the same lap against the earliest full-field completion. Label it as a lap-boundary interval. The loader warned about alignment for driver 77, outside the selected teams, and a 0.530-second session-end discrepancy for driver 63. Investigate effects before using field-reference gaps in final charts. Complete fields do not prove every value is correct.</w:t>
+        <w:t>The derived gap compares like-for-like lap completions, not live positions. Excluding unaligned driver 77 leaves every selected interval unchanged. Driver 63’s 0.530-second warning compares his finish with a later session-status message; it is not a timing correction. Selected finishing intervals match the published classification. Intermediate checks share the retained timing source. See the repository timing investigation for evidence and limits.</w:t>
       </w:r>
     </w:p>
     <w:p>
@@ -3125,7 +3125,7 @@
         <w:contextualSpacing w:val="0"/>
       </w:pPr>
       <w:r>
-        <w:t>Fuel load, traffic, weather and track evolution remain confounders. The pace rule is a starting point; stint phase and compound need further checks. Offline reprocessing and three regression tests passed. Human review by Roy and exploratory analysis remain pending.</w:t>
+        <w:t>Fuel load, traffic, weather and track evolution remain confounders. The pace rule is a starting point; stint phase and compound need further checks. Offline reprocessing and 22 tests passed. Human review by Roy and exploratory analysis remain pending.</w:t>
       </w:r>
     </w:p>
     <w:p>

</xml_diff>